<commit_message>
feat: icono VITO personaje en tab + estructura screenshots + informe R1 actualizado
- Reemplazado VITOMascot (Views) por PNG VITO_Personaje_Icon_2D en botón central
- Agregada estructura screenshots/ (sprint-1, sprint-3, sprint-5) con .gitkeep
- Actualizado INFORME_RELEASE_R1.md con tablas de capturas planificadas (16)
- Actualizado INFORME_RELEASE_R1.docx con notas de capturas pendientes
- Corregido tsconfig.json (moduleResolution: bundler) para Expo compatibility
</commit_message>
<xml_diff>
--- a/INFORME_RELEASE_R1.docx
+++ b/INFORME_RELEASE_R1.docx
@@ -2193,10 +2193,14 @@
     </w:p>
     <w:p>
       <w:r>
+        <w:t xml:space="preserve">Capturas planificadas: ver screenshots/sprint-1/ (login-form, register-form). </w:t>
+      </w:r>
+      <w:r>
         <w:rPr>
           <w:i/>
+          <w:sz w:val="20"/>
         </w:rPr>
-        <w:t>Nota: No se encontraron capturas de pantalla de las funcionalidades desarrolladas en el repositorio.</w:t>
+        <w:t>Requiere emulador Android o dispositivo físico para generar las imágenes.</w:t>
       </w:r>
     </w:p>
     <w:p>
@@ -5428,6 +5432,28 @@
       </w:tr>
     </w:tbl>
     <w:p/>
+    <w:p/>
+    <w:p>
+      <w:r>
+        <w:rPr>
+          <w:b/>
+          <w:sz w:val="20"/>
+        </w:rPr>
+        <w:t xml:space="preserve">Nota sobre screenshots: </w:t>
+      </w:r>
+      <w:r>
+        <w:rPr>
+          <w:sz w:val="20"/>
+        </w:rPr>
+        <w:t xml:space="preserve">Las capturas deben generarse con un emulador Android. </w:t>
+      </w:r>
+      <w:r>
+        <w:rPr>
+          <w:sz w:val="20"/>
+        </w:rPr>
+        <w:t>Estructura de directorios lista en screenshots/.</w:t>
+      </w:r>
+    </w:p>
     <w:p>
       <w:pPr>
         <w:pStyle w:val="Heading1"/>
@@ -5849,7 +5875,7 @@
           </w:tcPr>
           <w:p>
             <w:r>
-              <w:t>No hay capturas</w:t>
+              <w:t>Estructura screenshots/ creada con carpetas por sprint (sprint-1, sprint-3, sprint-5). Capturas documentadas en el informe markdown.</w:t>
             </w:r>
           </w:p>
         </w:tc>
@@ -5859,7 +5885,7 @@
           </w:tcPr>
           <w:p>
             <w:r>
-              <w:t>Tomar capturas de las 8 pantallas con emulador Android o dispositivo físico.</w:t>
+              <w:t>PENDIENTE: Capturar con emulador Android o dispositivo físico (16 capturas planificadas). Ver screenshots/ en el repositorio.</w:t>
             </w:r>
           </w:p>
         </w:tc>

</xml_diff>